<commit_message>
Logo in Angebotsvorlage einsetzen und Antworten zu S41, S61, Sonderpositionen einarbeiten
- Nösse-Logo aus dem Intranet in Deckblatt und Kopfzeile, Leerseite nach
  dem Deckblatt entfernt
- S41 als einzige Ausnahme von der Connect-Pflicht
- S61: VK = EK aus TERRA-Kalkulator / 0,55, Pflichtkopplung S21 und Backup
- Freie Sonderpositionen mit Freigabe durch die Vertriebsleitung
- B04/B06-Preisbildung bestätigt, AVV wird später nachgeliefert
- Neue Referenzfälle und offene Fragen (Abschnitt 10)

Co-Authored-By: Claude Opus 5.5 <noreply@anthropic.com>
Claude-Session: https://claude.ai/code/session_01KXwsZXuLnhXkK3KnwTqQAa
</commit_message>
<xml_diff>
--- a/templates/angebot/Musterangebot_Entwurf_v0.1.docx
+++ b/templates/angebot/Musterangebot_Entwurf_v0.1.docx
@@ -4,50 +4,47 @@
   <w:body>
     <w:p>
       <w:pPr>
-        <w:spacing w:after="0"/>
-      </w:pPr>
-      <w:r>
-        <w:rPr>
-          <w:rFonts w:ascii="Verdana" w:cs="Verdana" w:eastAsia="Verdana" w:hAnsi="Verdana"/>
-          <w:b/>
-          <w:bCs/>
-          <w:color w:val="006C88"/>
-          <w:sz w:val="56"/>
-          <w:szCs w:val="56"/>
-        </w:rPr>
-        <w:t xml:space="preserve">Nösse</w:t>
-      </w:r>
-    </w:p>
-    <w:p>
-      <w:pPr>
-        <w:spacing w:after="60"/>
-      </w:pPr>
-      <w:r>
-        <w:rPr>
-          <w:rFonts w:ascii="Verdana" w:cs="Verdana" w:eastAsia="Verdana" w:hAnsi="Verdana"/>
-          <w:b/>
-          <w:bCs/>
-          <w:color w:val="737373"/>
-          <w:sz w:val="16"/>
-          <w:szCs w:val="16"/>
-        </w:rPr>
-        <w:t xml:space="preserve">IHR IT-UMSORGER.</w:t>
-      </w:r>
-    </w:p>
-    <w:p>
-      <w:pPr>
-        <w:spacing w:after="1800" w:before="0" w:line="276"/>
-      </w:pPr>
-      <w:r>
-        <w:rPr>
-          <w:rFonts w:ascii="Verdana" w:cs="Verdana" w:eastAsia="Verdana" w:hAnsi="Verdana"/>
-          <w:i/>
-          <w:iCs/>
-          <w:color w:val="737373"/>
-          <w:sz w:val="14"/>
-          <w:szCs w:val="14"/>
-        </w:rPr>
-        <w:t xml:space="preserve">[Platzhalter: Logo aus ELO &gt; Marketing &gt; Logo einsetzen]</w:t>
+        <w:spacing w:after="1800"/>
+      </w:pPr>
+      <w:r>
+        <w:drawing>
+          <wp:inline distT="0" distB="0" distL="0" distR="0">
+            <wp:extent cx="2190750" cy="923925"/>
+            <wp:effectExtent t="0" r="0" b="0" l="0"/>
+            <wp:docPr id="1" name="" descr="" title=""/>
+            <wp:cNvGraphicFramePr>
+              <a:graphicFrameLocks xmlns:a="http://schemas.openxmlformats.org/drawingml/2006/main" noChangeAspect="1"/>
+            </wp:cNvGraphicFramePr>
+            <a:graphic xmlns:a="http://schemas.openxmlformats.org/drawingml/2006/main">
+              <a:graphicData uri="http://schemas.openxmlformats.org/drawingml/2006/picture">
+                <pic:pic xmlns:pic="http://schemas.openxmlformats.org/drawingml/2006/picture">
+                  <pic:nvPicPr>
+                    <pic:cNvPr id="0" name="" descr=""/>
+                    <pic:cNvPicPr>
+                      <a:picLocks noChangeAspect="1" noChangeArrowheads="1"/>
+                    </pic:cNvPicPr>
+                  </pic:nvPicPr>
+                  <pic:blipFill>
+                    <a:blip r:embed="rId9" cstate="none"/>
+                    <a:srcRect/>
+                    <a:stretch>
+                      <a:fillRect/>
+                    </a:stretch>
+                  </pic:blipFill>
+                  <pic:spPr bwMode="auto">
+                    <a:xfrm>
+                      <a:off x="0" y="0"/>
+                      <a:ext cx="2190750" cy="923925"/>
+                    </a:xfrm>
+                    <a:prstGeom prst="rect">
+                      <a:avLst/>
+                    </a:prstGeom>
+                  </pic:spPr>
+                </pic:pic>
+              </a:graphicData>
+            </a:graphic>
+          </wp:inline>
+        </w:drawing>
       </w:r>
     </w:p>
     <w:p>
@@ -457,11 +454,6 @@
         </w:tc>
       </w:tr>
     </w:tbl>
-    <w:p>
-      <w:r>
-        <w:br w:type="page"/>
-      </w:r>
-    </w:p>
     <w:p>
       <w:pPr>
         <w:sectPr>
@@ -5042,15 +5034,44 @@
       </w:tabs>
     </w:pPr>
     <w:r>
-      <w:rPr>
-        <w:rFonts w:ascii="Verdana" w:cs="Verdana" w:eastAsia="Verdana" w:hAnsi="Verdana"/>
-        <w:b/>
-        <w:bCs/>
-        <w:color w:val="006C88"/>
-        <w:sz w:val="20"/>
-        <w:szCs w:val="20"/>
-      </w:rPr>
-      <w:t xml:space="preserve">Nösse</w:t>
+      <w:drawing>
+        <wp:inline distT="0" distB="0" distL="0" distR="0">
+          <wp:extent cx="666750" cy="276225"/>
+          <wp:effectExtent t="0" r="0" b="0" l="0"/>
+          <wp:docPr id="1" name="" descr="" title=""/>
+          <wp:cNvGraphicFramePr>
+            <a:graphicFrameLocks xmlns:a="http://schemas.openxmlformats.org/drawingml/2006/main" noChangeAspect="1"/>
+          </wp:cNvGraphicFramePr>
+          <a:graphic xmlns:a="http://schemas.openxmlformats.org/drawingml/2006/main">
+            <a:graphicData uri="http://schemas.openxmlformats.org/drawingml/2006/picture">
+              <pic:pic xmlns:pic="http://schemas.openxmlformats.org/drawingml/2006/picture">
+                <pic:nvPicPr>
+                  <pic:cNvPr id="0" name="" descr=""/>
+                  <pic:cNvPicPr>
+                    <a:picLocks noChangeAspect="1" noChangeArrowheads="1"/>
+                  </pic:cNvPicPr>
+                </pic:nvPicPr>
+                <pic:blipFill>
+                  <a:blip r:embed="rId0" cstate="none"/>
+                  <a:srcRect/>
+                  <a:stretch>
+                    <a:fillRect/>
+                  </a:stretch>
+                </pic:blipFill>
+                <pic:spPr bwMode="auto">
+                  <a:xfrm>
+                    <a:off x="0" y="0"/>
+                    <a:ext cx="666750" cy="276225"/>
+                  </a:xfrm>
+                  <a:prstGeom prst="rect">
+                    <a:avLst/>
+                  </a:prstGeom>
+                </pic:spPr>
+              </pic:pic>
+            </a:graphicData>
+          </a:graphic>
+        </wp:inline>
+      </w:drawing>
     </w:r>
     <w:r>
       <w:rPr>

</xml_diff>